<commit_message>
Expands middleware spec chunks for improved detail
Splits and significantly extends documentation extraction for middleware features and integrations, enabling granular access to technical rules, data mapping, business validations, error handling, and API interoperability.
Facilitates future refinements and automated processing of functional requirements.
</commit_message>
<xml_diff>
--- a/chrono-docs/3.docx
+++ b/chrono-docs/3.docx
@@ -1875,13 +1875,14 @@
       </w:tblPr>
       <w:tblGrid>
         <w:gridCol w:w="4199"/>
-        <w:gridCol w:w="1544"/>
-        <w:gridCol w:w="1547"/>
-        <w:gridCol w:w="1258"/>
-        <w:gridCol w:w="1922"/>
+        <w:gridCol w:w="1543"/>
+        <w:gridCol w:w="1548"/>
+        <w:gridCol w:w="1257"/>
+        <w:gridCol w:w="1923"/>
       </w:tblGrid>
       <w:tr>
         <w:trPr>
+          <w:tblHeader w:val="true"/>
           <w:trHeight w:val="420" w:hRule="atLeast"/>
         </w:trPr>
         <w:tc>
@@ -1922,7 +1923,7 @@
         </w:tc>
         <w:tc>
           <w:tcPr>
-            <w:tcW w:w="4349" w:type="dxa"/>
+            <w:tcW w:w="4348" w:type="dxa"/>
             <w:gridSpan w:val="3"/>
             <w:tcBorders>
               <w:top w:val="single" w:sz="8" w:space="0" w:color="000000"/>
@@ -1960,7 +1961,7 @@
         </w:tc>
         <w:tc>
           <w:tcPr>
-            <w:tcW w:w="1922" w:type="dxa"/>
+            <w:tcW w:w="1923" w:type="dxa"/>
             <w:vMerge w:val="restart"/>
             <w:tcBorders>
               <w:top w:val="single" w:sz="8" w:space="0" w:color="000000"/>
@@ -2027,6 +2028,7 @@
       </w:tr>
       <w:tr>
         <w:trPr>
+          <w:tblHeader w:val="true"/>
           <w:trHeight w:val="420" w:hRule="atLeast"/>
         </w:trPr>
         <w:tc>
@@ -2064,7 +2066,7 @@
         </w:tc>
         <w:tc>
           <w:tcPr>
-            <w:tcW w:w="1544" w:type="dxa"/>
+            <w:tcW w:w="1543" w:type="dxa"/>
             <w:tcBorders>
               <w:top w:val="single" w:sz="8" w:space="0" w:color="000000"/>
               <w:left w:val="single" w:sz="8" w:space="0" w:color="CCCCCC"/>
@@ -2099,7 +2101,7 @@
         </w:tc>
         <w:tc>
           <w:tcPr>
-            <w:tcW w:w="1547" w:type="dxa"/>
+            <w:tcW w:w="1548" w:type="dxa"/>
             <w:tcBorders>
               <w:top w:val="single" w:sz="8" w:space="0" w:color="000000"/>
               <w:left w:val="single" w:sz="8" w:space="0" w:color="CCCCCC"/>
@@ -2134,7 +2136,7 @@
         </w:tc>
         <w:tc>
           <w:tcPr>
-            <w:tcW w:w="1258" w:type="dxa"/>
+            <w:tcW w:w="1257" w:type="dxa"/>
             <w:tcBorders>
               <w:top w:val="single" w:sz="8" w:space="0" w:color="000000"/>
               <w:left w:val="single" w:sz="8" w:space="0" w:color="CCCCCC"/>
@@ -2169,7 +2171,7 @@
         </w:tc>
         <w:tc>
           <w:tcPr>
-            <w:tcW w:w="1922" w:type="dxa"/>
+            <w:tcW w:w="1923" w:type="dxa"/>
             <w:vMerge w:val="continue"/>
             <w:tcBorders>
               <w:top w:val="single" w:sz="8" w:space="0" w:color="000000"/>
@@ -2234,7 +2236,7 @@
         </w:tc>
         <w:tc>
           <w:tcPr>
-            <w:tcW w:w="1544" w:type="dxa"/>
+            <w:tcW w:w="1543" w:type="dxa"/>
             <w:tcBorders>
               <w:top w:val="single" w:sz="8" w:space="0" w:color="000000"/>
               <w:left w:val="single" w:sz="8" w:space="0" w:color="000000"/>
@@ -2271,7 +2273,7 @@
         </w:tc>
         <w:tc>
           <w:tcPr>
-            <w:tcW w:w="1547" w:type="dxa"/>
+            <w:tcW w:w="1548" w:type="dxa"/>
             <w:tcBorders>
               <w:top w:val="single" w:sz="6" w:space="0" w:color="000000"/>
               <w:left w:val="single" w:sz="6" w:space="0" w:color="000000"/>
@@ -2308,7 +2310,7 @@
         </w:tc>
         <w:tc>
           <w:tcPr>
-            <w:tcW w:w="1258" w:type="dxa"/>
+            <w:tcW w:w="1257" w:type="dxa"/>
             <w:tcBorders>
               <w:top w:val="single" w:sz="6" w:space="0" w:color="000000"/>
               <w:left w:val="single" w:sz="6" w:space="0" w:color="000000"/>
@@ -2345,7 +2347,7 @@
         </w:tc>
         <w:tc>
           <w:tcPr>
-            <w:tcW w:w="1922" w:type="dxa"/>
+            <w:tcW w:w="1923" w:type="dxa"/>
             <w:tcBorders>
               <w:top w:val="single" w:sz="8" w:space="0" w:color="000000"/>
               <w:left w:val="single" w:sz="8" w:space="0" w:color="000000"/>
@@ -2409,7 +2411,7 @@
         </w:tc>
         <w:tc>
           <w:tcPr>
-            <w:tcW w:w="1544" w:type="dxa"/>
+            <w:tcW w:w="1543" w:type="dxa"/>
             <w:tcBorders>
               <w:top w:val="single" w:sz="8" w:space="0" w:color="000000"/>
               <w:left w:val="single" w:sz="8" w:space="0" w:color="000000"/>
@@ -2446,7 +2448,7 @@
         </w:tc>
         <w:tc>
           <w:tcPr>
-            <w:tcW w:w="1547" w:type="dxa"/>
+            <w:tcW w:w="1548" w:type="dxa"/>
             <w:tcBorders>
               <w:top w:val="single" w:sz="6" w:space="0" w:color="CCCCCC"/>
               <w:left w:val="single" w:sz="6" w:space="0" w:color="000000"/>
@@ -2483,7 +2485,7 @@
         </w:tc>
         <w:tc>
           <w:tcPr>
-            <w:tcW w:w="1258" w:type="dxa"/>
+            <w:tcW w:w="1257" w:type="dxa"/>
             <w:tcBorders>
               <w:top w:val="single" w:sz="6" w:space="0" w:color="CCCCCC"/>
               <w:left w:val="single" w:sz="6" w:space="0" w:color="000000"/>
@@ -2520,7 +2522,7 @@
         </w:tc>
         <w:tc>
           <w:tcPr>
-            <w:tcW w:w="1922" w:type="dxa"/>
+            <w:tcW w:w="1923" w:type="dxa"/>
             <w:tcBorders>
               <w:top w:val="single" w:sz="8" w:space="0" w:color="000000"/>
               <w:left w:val="single" w:sz="8" w:space="0" w:color="000000"/>
@@ -2596,7 +2598,7 @@
         </w:tc>
         <w:tc>
           <w:tcPr>
-            <w:tcW w:w="1544" w:type="dxa"/>
+            <w:tcW w:w="1543" w:type="dxa"/>
             <w:tcBorders>
               <w:top w:val="single" w:sz="8" w:space="0" w:color="000000"/>
               <w:left w:val="single" w:sz="8" w:space="0" w:color="000000"/>
@@ -2633,7 +2635,7 @@
         </w:tc>
         <w:tc>
           <w:tcPr>
-            <w:tcW w:w="1547" w:type="dxa"/>
+            <w:tcW w:w="1548" w:type="dxa"/>
             <w:tcBorders>
               <w:top w:val="single" w:sz="6" w:space="0" w:color="CCCCCC"/>
               <w:left w:val="single" w:sz="6" w:space="0" w:color="000000"/>
@@ -2670,7 +2672,7 @@
         </w:tc>
         <w:tc>
           <w:tcPr>
-            <w:tcW w:w="1258" w:type="dxa"/>
+            <w:tcW w:w="1257" w:type="dxa"/>
             <w:tcBorders>
               <w:top w:val="single" w:sz="6" w:space="0" w:color="CCCCCC"/>
               <w:left w:val="single" w:sz="6" w:space="0" w:color="000000"/>
@@ -2707,7 +2709,7 @@
         </w:tc>
         <w:tc>
           <w:tcPr>
-            <w:tcW w:w="1922" w:type="dxa"/>
+            <w:tcW w:w="1923" w:type="dxa"/>
             <w:tcBorders>
               <w:top w:val="single" w:sz="8" w:space="0" w:color="000000"/>
               <w:left w:val="single" w:sz="8" w:space="0" w:color="000000"/>
@@ -2783,7 +2785,7 @@
         </w:tc>
         <w:tc>
           <w:tcPr>
-            <w:tcW w:w="1544" w:type="dxa"/>
+            <w:tcW w:w="1543" w:type="dxa"/>
             <w:tcBorders>
               <w:top w:val="single" w:sz="8" w:space="0" w:color="000000"/>
               <w:left w:val="single" w:sz="8" w:space="0" w:color="000000"/>
@@ -2820,7 +2822,7 @@
         </w:tc>
         <w:tc>
           <w:tcPr>
-            <w:tcW w:w="1547" w:type="dxa"/>
+            <w:tcW w:w="1548" w:type="dxa"/>
             <w:tcBorders>
               <w:top w:val="single" w:sz="6" w:space="0" w:color="CCCCCC"/>
               <w:left w:val="single" w:sz="6" w:space="0" w:color="000000"/>
@@ -2857,7 +2859,7 @@
         </w:tc>
         <w:tc>
           <w:tcPr>
-            <w:tcW w:w="1258" w:type="dxa"/>
+            <w:tcW w:w="1257" w:type="dxa"/>
             <w:tcBorders>
               <w:top w:val="single" w:sz="6" w:space="0" w:color="CCCCCC"/>
               <w:left w:val="single" w:sz="6" w:space="0" w:color="000000"/>
@@ -2894,7 +2896,7 @@
         </w:tc>
         <w:tc>
           <w:tcPr>
-            <w:tcW w:w="1922" w:type="dxa"/>
+            <w:tcW w:w="1923" w:type="dxa"/>
             <w:tcBorders>
               <w:top w:val="single" w:sz="8" w:space="0" w:color="000000"/>
               <w:left w:val="single" w:sz="8" w:space="0" w:color="000000"/>
@@ -2958,7 +2960,7 @@
         </w:tc>
         <w:tc>
           <w:tcPr>
-            <w:tcW w:w="1544" w:type="dxa"/>
+            <w:tcW w:w="1543" w:type="dxa"/>
             <w:tcBorders>
               <w:top w:val="single" w:sz="8" w:space="0" w:color="000000"/>
               <w:left w:val="single" w:sz="8" w:space="0" w:color="000000"/>
@@ -2995,7 +2997,7 @@
         </w:tc>
         <w:tc>
           <w:tcPr>
-            <w:tcW w:w="1547" w:type="dxa"/>
+            <w:tcW w:w="1548" w:type="dxa"/>
             <w:tcBorders>
               <w:top w:val="single" w:sz="6" w:space="0" w:color="CCCCCC"/>
               <w:left w:val="single" w:sz="6" w:space="0" w:color="000000"/>
@@ -3032,7 +3034,7 @@
         </w:tc>
         <w:tc>
           <w:tcPr>
-            <w:tcW w:w="1258" w:type="dxa"/>
+            <w:tcW w:w="1257" w:type="dxa"/>
             <w:tcBorders>
               <w:top w:val="single" w:sz="6" w:space="0" w:color="CCCCCC"/>
               <w:left w:val="single" w:sz="6" w:space="0" w:color="000000"/>
@@ -3069,7 +3071,7 @@
         </w:tc>
         <w:tc>
           <w:tcPr>
-            <w:tcW w:w="1922" w:type="dxa"/>
+            <w:tcW w:w="1923" w:type="dxa"/>
             <w:tcBorders>
               <w:top w:val="single" w:sz="8" w:space="0" w:color="000000"/>
               <w:left w:val="single" w:sz="8" w:space="0" w:color="000000"/>
@@ -3133,7 +3135,7 @@
         </w:tc>
         <w:tc>
           <w:tcPr>
-            <w:tcW w:w="1544" w:type="dxa"/>
+            <w:tcW w:w="1543" w:type="dxa"/>
             <w:tcBorders>
               <w:top w:val="single" w:sz="8" w:space="0" w:color="000000"/>
               <w:left w:val="single" w:sz="8" w:space="0" w:color="000000"/>
@@ -3170,7 +3172,7 @@
         </w:tc>
         <w:tc>
           <w:tcPr>
-            <w:tcW w:w="1547" w:type="dxa"/>
+            <w:tcW w:w="1548" w:type="dxa"/>
             <w:tcBorders>
               <w:top w:val="single" w:sz="6" w:space="0" w:color="CCCCCC"/>
               <w:left w:val="single" w:sz="6" w:space="0" w:color="000000"/>
@@ -3207,7 +3209,7 @@
         </w:tc>
         <w:tc>
           <w:tcPr>
-            <w:tcW w:w="1258" w:type="dxa"/>
+            <w:tcW w:w="1257" w:type="dxa"/>
             <w:tcBorders>
               <w:top w:val="single" w:sz="6" w:space="0" w:color="CCCCCC"/>
               <w:left w:val="single" w:sz="6" w:space="0" w:color="000000"/>
@@ -3244,7 +3246,7 @@
         </w:tc>
         <w:tc>
           <w:tcPr>
-            <w:tcW w:w="1922" w:type="dxa"/>
+            <w:tcW w:w="1923" w:type="dxa"/>
             <w:tcBorders>
               <w:top w:val="single" w:sz="8" w:space="0" w:color="000000"/>
               <w:left w:val="single" w:sz="8" w:space="0" w:color="000000"/>
@@ -3320,7 +3322,7 @@
         </w:tc>
         <w:tc>
           <w:tcPr>
-            <w:tcW w:w="1544" w:type="dxa"/>
+            <w:tcW w:w="1543" w:type="dxa"/>
             <w:tcBorders>
               <w:top w:val="single" w:sz="8" w:space="0" w:color="000000"/>
               <w:left w:val="single" w:sz="8" w:space="0" w:color="000000"/>
@@ -3357,7 +3359,7 @@
         </w:tc>
         <w:tc>
           <w:tcPr>
-            <w:tcW w:w="1547" w:type="dxa"/>
+            <w:tcW w:w="1548" w:type="dxa"/>
             <w:tcBorders>
               <w:top w:val="single" w:sz="6" w:space="0" w:color="CCCCCC"/>
               <w:left w:val="single" w:sz="6" w:space="0" w:color="000000"/>
@@ -3394,7 +3396,7 @@
         </w:tc>
         <w:tc>
           <w:tcPr>
-            <w:tcW w:w="1258" w:type="dxa"/>
+            <w:tcW w:w="1257" w:type="dxa"/>
             <w:tcBorders>
               <w:top w:val="single" w:sz="6" w:space="0" w:color="CCCCCC"/>
               <w:left w:val="single" w:sz="6" w:space="0" w:color="000000"/>
@@ -3431,7 +3433,7 @@
         </w:tc>
         <w:tc>
           <w:tcPr>
-            <w:tcW w:w="1922" w:type="dxa"/>
+            <w:tcW w:w="1923" w:type="dxa"/>
             <w:tcBorders>
               <w:top w:val="single" w:sz="8" w:space="0" w:color="000000"/>
               <w:left w:val="single" w:sz="8" w:space="0" w:color="000000"/>
@@ -8324,7 +8326,9 @@
         <w:gridCol w:w="4770"/>
       </w:tblGrid>
       <w:tr>
-        <w:trPr/>
+        <w:trPr>
+          <w:tblHeader w:val="true"/>
+        </w:trPr>
         <w:tc>
           <w:tcPr>
             <w:tcW w:w="4499" w:type="dxa"/>
@@ -21684,19 +21688,20 @@
         <w:tblLook w:val="0600"/>
       </w:tblPr>
       <w:tblGrid>
-        <w:gridCol w:w="4198"/>
-        <w:gridCol w:w="1542"/>
+        <w:gridCol w:w="4197"/>
+        <w:gridCol w:w="1543"/>
         <w:gridCol w:w="1520"/>
         <w:gridCol w:w="1520"/>
         <w:gridCol w:w="1680"/>
       </w:tblGrid>
       <w:tr>
         <w:trPr>
+          <w:tblHeader w:val="true"/>
           <w:trHeight w:val="420" w:hRule="atLeast"/>
         </w:trPr>
         <w:tc>
           <w:tcPr>
-            <w:tcW w:w="4198" w:type="dxa"/>
+            <w:tcW w:w="4197" w:type="dxa"/>
             <w:vMerge w:val="restart"/>
             <w:tcBorders>
               <w:top w:val="single" w:sz="8" w:space="0" w:color="000000"/>
@@ -21732,7 +21737,7 @@
         </w:tc>
         <w:tc>
           <w:tcPr>
-            <w:tcW w:w="4582" w:type="dxa"/>
+            <w:tcW w:w="4583" w:type="dxa"/>
             <w:gridSpan w:val="3"/>
             <w:tcBorders>
               <w:top w:val="single" w:sz="8" w:space="0" w:color="000000"/>
@@ -21837,11 +21842,12 @@
       </w:tr>
       <w:tr>
         <w:trPr>
+          <w:tblHeader w:val="true"/>
           <w:trHeight w:val="420" w:hRule="atLeast"/>
         </w:trPr>
         <w:tc>
           <w:tcPr>
-            <w:tcW w:w="4198" w:type="dxa"/>
+            <w:tcW w:w="4197" w:type="dxa"/>
             <w:vMerge w:val="continue"/>
             <w:tcBorders>
               <w:top w:val="single" w:sz="8" w:space="0" w:color="000000"/>
@@ -21874,7 +21880,7 @@
         </w:tc>
         <w:tc>
           <w:tcPr>
-            <w:tcW w:w="1542" w:type="dxa"/>
+            <w:tcW w:w="1543" w:type="dxa"/>
             <w:tcBorders>
               <w:top w:val="single" w:sz="8" w:space="0" w:color="000000"/>
               <w:left w:val="single" w:sz="8" w:space="0" w:color="CCCCCC"/>
@@ -22013,7 +22019,7 @@
         <w:trPr/>
         <w:tc>
           <w:tcPr>
-            <w:tcW w:w="4198" w:type="dxa"/>
+            <w:tcW w:w="4197" w:type="dxa"/>
             <w:tcBorders>
               <w:top w:val="single" w:sz="8" w:space="0" w:color="000000"/>
               <w:left w:val="single" w:sz="8" w:space="0" w:color="000000"/>
@@ -22044,7 +22050,7 @@
         </w:tc>
         <w:tc>
           <w:tcPr>
-            <w:tcW w:w="1542" w:type="dxa"/>
+            <w:tcW w:w="1543" w:type="dxa"/>
             <w:tcBorders>
               <w:top w:val="single" w:sz="8" w:space="0" w:color="000000"/>
               <w:left w:val="single" w:sz="8" w:space="0" w:color="000000"/>
@@ -22188,7 +22194,7 @@
         <w:trPr/>
         <w:tc>
           <w:tcPr>
-            <w:tcW w:w="4198" w:type="dxa"/>
+            <w:tcW w:w="4197" w:type="dxa"/>
             <w:tcBorders>
               <w:top w:val="single" w:sz="8" w:space="0" w:color="000000"/>
               <w:left w:val="single" w:sz="8" w:space="0" w:color="000000"/>
@@ -22219,7 +22225,7 @@
         </w:tc>
         <w:tc>
           <w:tcPr>
-            <w:tcW w:w="1542" w:type="dxa"/>
+            <w:tcW w:w="1543" w:type="dxa"/>
             <w:tcBorders>
               <w:top w:val="single" w:sz="8" w:space="0" w:color="000000"/>
               <w:left w:val="single" w:sz="8" w:space="0" w:color="000000"/>
@@ -23236,16 +23242,17 @@
         <w:tblLook w:val="0600"/>
       </w:tblPr>
       <w:tblGrid>
-        <w:gridCol w:w="3898"/>
-        <w:gridCol w:w="6181"/>
+        <w:gridCol w:w="3897"/>
+        <w:gridCol w:w="6182"/>
       </w:tblGrid>
       <w:tr>
         <w:trPr>
+          <w:tblHeader w:val="true"/>
           <w:trHeight w:val="285" w:hRule="atLeast"/>
         </w:trPr>
         <w:tc>
           <w:tcPr>
-            <w:tcW w:w="3898" w:type="dxa"/>
+            <w:tcW w:w="3897" w:type="dxa"/>
             <w:tcBorders>
               <w:top w:val="single" w:sz="6" w:space="0" w:color="000000"/>
               <w:left w:val="single" w:sz="6" w:space="0" w:color="000000"/>
@@ -23280,7 +23287,7 @@
         </w:tc>
         <w:tc>
           <w:tcPr>
-            <w:tcW w:w="6181" w:type="dxa"/>
+            <w:tcW w:w="6182" w:type="dxa"/>
             <w:tcBorders>
               <w:top w:val="single" w:sz="6" w:space="0" w:color="000000"/>
               <w:left w:val="single" w:sz="6" w:space="0" w:color="CCCCCC"/>
@@ -23320,7 +23327,7 @@
         </w:trPr>
         <w:tc>
           <w:tcPr>
-            <w:tcW w:w="3898" w:type="dxa"/>
+            <w:tcW w:w="3897" w:type="dxa"/>
             <w:tcBorders>
               <w:top w:val="single" w:sz="6" w:space="0" w:color="CCCCCC"/>
               <w:left w:val="single" w:sz="6" w:space="0" w:color="000000"/>
@@ -23356,7 +23363,7 @@
         </w:tc>
         <w:tc>
           <w:tcPr>
-            <w:tcW w:w="6181" w:type="dxa"/>
+            <w:tcW w:w="6182" w:type="dxa"/>
             <w:tcBorders>
               <w:top w:val="single" w:sz="6" w:space="0" w:color="CCCCCC"/>
               <w:left w:val="single" w:sz="6" w:space="0" w:color="CCCCCC"/>
@@ -23392,7 +23399,7 @@
         </w:trPr>
         <w:tc>
           <w:tcPr>
-            <w:tcW w:w="3898" w:type="dxa"/>
+            <w:tcW w:w="3897" w:type="dxa"/>
             <w:tcBorders>
               <w:top w:val="single" w:sz="6" w:space="0" w:color="CCCCCC"/>
               <w:left w:val="single" w:sz="6" w:space="0" w:color="000000"/>
@@ -23428,7 +23435,7 @@
         </w:tc>
         <w:tc>
           <w:tcPr>
-            <w:tcW w:w="6181" w:type="dxa"/>
+            <w:tcW w:w="6182" w:type="dxa"/>
             <w:tcBorders>
               <w:top w:val="single" w:sz="6" w:space="0" w:color="CCCCCC"/>
               <w:left w:val="single" w:sz="6" w:space="0" w:color="CCCCCC"/>
@@ -23464,7 +23471,7 @@
         </w:trPr>
         <w:tc>
           <w:tcPr>
-            <w:tcW w:w="3898" w:type="dxa"/>
+            <w:tcW w:w="3897" w:type="dxa"/>
             <w:tcBorders>
               <w:top w:val="single" w:sz="6" w:space="0" w:color="CCCCCC"/>
               <w:left w:val="single" w:sz="6" w:space="0" w:color="000000"/>
@@ -23500,7 +23507,7 @@
         </w:tc>
         <w:tc>
           <w:tcPr>
-            <w:tcW w:w="6181" w:type="dxa"/>
+            <w:tcW w:w="6182" w:type="dxa"/>
             <w:tcBorders>
               <w:top w:val="single" w:sz="6" w:space="0" w:color="CCCCCC"/>
               <w:left w:val="single" w:sz="6" w:space="0" w:color="CCCCCC"/>
@@ -23536,7 +23543,7 @@
         </w:trPr>
         <w:tc>
           <w:tcPr>
-            <w:tcW w:w="3898" w:type="dxa"/>
+            <w:tcW w:w="3897" w:type="dxa"/>
             <w:tcBorders>
               <w:top w:val="single" w:sz="6" w:space="0" w:color="CCCCCC"/>
               <w:left w:val="single" w:sz="6" w:space="0" w:color="000000"/>
@@ -23572,7 +23579,7 @@
         </w:tc>
         <w:tc>
           <w:tcPr>
-            <w:tcW w:w="6181" w:type="dxa"/>
+            <w:tcW w:w="6182" w:type="dxa"/>
             <w:tcBorders>
               <w:top w:val="single" w:sz="6" w:space="0" w:color="CCCCCC"/>
               <w:left w:val="single" w:sz="6" w:space="0" w:color="CCCCCC"/>
@@ -23608,7 +23615,7 @@
         </w:trPr>
         <w:tc>
           <w:tcPr>
-            <w:tcW w:w="3898" w:type="dxa"/>
+            <w:tcW w:w="3897" w:type="dxa"/>
             <w:tcBorders>
               <w:top w:val="single" w:sz="6" w:space="0" w:color="CCCCCC"/>
               <w:left w:val="single" w:sz="6" w:space="0" w:color="000000"/>
@@ -23644,7 +23651,7 @@
         </w:tc>
         <w:tc>
           <w:tcPr>
-            <w:tcW w:w="6181" w:type="dxa"/>
+            <w:tcW w:w="6182" w:type="dxa"/>
             <w:tcBorders>
               <w:top w:val="single" w:sz="6" w:space="0" w:color="CCCCCC"/>
               <w:left w:val="single" w:sz="6" w:space="0" w:color="CCCCCC"/>
@@ -23712,7 +23719,7 @@
         </w:trPr>
         <w:tc>
           <w:tcPr>
-            <w:tcW w:w="3898" w:type="dxa"/>
+            <w:tcW w:w="3897" w:type="dxa"/>
             <w:tcBorders>
               <w:top w:val="single" w:sz="6" w:space="0" w:color="CCCCCC"/>
               <w:left w:val="single" w:sz="6" w:space="0" w:color="000000"/>
@@ -23748,7 +23755,7 @@
         </w:tc>
         <w:tc>
           <w:tcPr>
-            <w:tcW w:w="6181" w:type="dxa"/>
+            <w:tcW w:w="6182" w:type="dxa"/>
             <w:tcBorders>
               <w:top w:val="single" w:sz="6" w:space="0" w:color="CCCCCC"/>
               <w:left w:val="single" w:sz="6" w:space="0" w:color="CCCCCC"/>
@@ -23869,7 +23876,7 @@
         </w:trPr>
         <w:tc>
           <w:tcPr>
-            <w:tcW w:w="3898" w:type="dxa"/>
+            <w:tcW w:w="3897" w:type="dxa"/>
             <w:tcBorders>
               <w:top w:val="single" w:sz="6" w:space="0" w:color="CCCCCC"/>
               <w:left w:val="single" w:sz="6" w:space="0" w:color="000000"/>
@@ -23905,7 +23912,7 @@
         </w:tc>
         <w:tc>
           <w:tcPr>
-            <w:tcW w:w="6181" w:type="dxa"/>
+            <w:tcW w:w="6182" w:type="dxa"/>
             <w:tcBorders>
               <w:top w:val="single" w:sz="6" w:space="0" w:color="CCCCCC"/>
               <w:left w:val="single" w:sz="6" w:space="0" w:color="CCCCCC"/>
@@ -24033,7 +24040,7 @@
         </w:trPr>
         <w:tc>
           <w:tcPr>
-            <w:tcW w:w="3898" w:type="dxa"/>
+            <w:tcW w:w="3897" w:type="dxa"/>
             <w:tcBorders>
               <w:top w:val="single" w:sz="6" w:space="0" w:color="CCCCCC"/>
               <w:left w:val="single" w:sz="6" w:space="0" w:color="000000"/>
@@ -24069,7 +24076,7 @@
         </w:tc>
         <w:tc>
           <w:tcPr>
-            <w:tcW w:w="6181" w:type="dxa"/>
+            <w:tcW w:w="6182" w:type="dxa"/>
             <w:tcBorders>
               <w:top w:val="single" w:sz="6" w:space="0" w:color="CCCCCC"/>
               <w:left w:val="single" w:sz="6" w:space="0" w:color="CCCCCC"/>
@@ -24105,7 +24112,7 @@
         </w:trPr>
         <w:tc>
           <w:tcPr>
-            <w:tcW w:w="3898" w:type="dxa"/>
+            <w:tcW w:w="3897" w:type="dxa"/>
             <w:tcBorders>
               <w:top w:val="single" w:sz="6" w:space="0" w:color="CCCCCC"/>
               <w:left w:val="single" w:sz="6" w:space="0" w:color="000000"/>
@@ -24141,7 +24148,7 @@
         </w:tc>
         <w:tc>
           <w:tcPr>
-            <w:tcW w:w="6181" w:type="dxa"/>
+            <w:tcW w:w="6182" w:type="dxa"/>
             <w:tcBorders>
               <w:top w:val="single" w:sz="6" w:space="0" w:color="CCCCCC"/>
               <w:left w:val="single" w:sz="6" w:space="0" w:color="CCCCCC"/>
@@ -24193,7 +24200,7 @@
         </w:trPr>
         <w:tc>
           <w:tcPr>
-            <w:tcW w:w="3898" w:type="dxa"/>
+            <w:tcW w:w="3897" w:type="dxa"/>
             <w:tcBorders>
               <w:top w:val="single" w:sz="6" w:space="0" w:color="CCCCCC"/>
               <w:left w:val="single" w:sz="6" w:space="0" w:color="000000"/>
@@ -24229,7 +24236,7 @@
         </w:tc>
         <w:tc>
           <w:tcPr>
-            <w:tcW w:w="6181" w:type="dxa"/>
+            <w:tcW w:w="6182" w:type="dxa"/>
             <w:tcBorders>
               <w:top w:val="single" w:sz="6" w:space="0" w:color="CCCCCC"/>
               <w:left w:val="single" w:sz="6" w:space="0" w:color="CCCCCC"/>
@@ -24297,7 +24304,7 @@
         </w:trPr>
         <w:tc>
           <w:tcPr>
-            <w:tcW w:w="3898" w:type="dxa"/>
+            <w:tcW w:w="3897" w:type="dxa"/>
             <w:tcBorders>
               <w:top w:val="single" w:sz="6" w:space="0" w:color="CCCCCC"/>
               <w:left w:val="single" w:sz="6" w:space="0" w:color="000000"/>
@@ -24333,7 +24340,7 @@
         </w:tc>
         <w:tc>
           <w:tcPr>
-            <w:tcW w:w="6181" w:type="dxa"/>
+            <w:tcW w:w="6182" w:type="dxa"/>
             <w:tcBorders>
               <w:top w:val="single" w:sz="6" w:space="0" w:color="CCCCCC"/>
               <w:left w:val="single" w:sz="6" w:space="0" w:color="CCCCCC"/>
@@ -24369,7 +24376,7 @@
         </w:trPr>
         <w:tc>
           <w:tcPr>
-            <w:tcW w:w="3898" w:type="dxa"/>
+            <w:tcW w:w="3897" w:type="dxa"/>
             <w:tcBorders>
               <w:top w:val="single" w:sz="6" w:space="0" w:color="CCCCCC"/>
               <w:left w:val="single" w:sz="6" w:space="0" w:color="000000"/>
@@ -24405,7 +24412,7 @@
         </w:tc>
         <w:tc>
           <w:tcPr>
-            <w:tcW w:w="6181" w:type="dxa"/>
+            <w:tcW w:w="6182" w:type="dxa"/>
             <w:tcBorders>
               <w:top w:val="single" w:sz="6" w:space="0" w:color="CCCCCC"/>
               <w:left w:val="single" w:sz="6" w:space="0" w:color="CCCCCC"/>
@@ -24441,7 +24448,7 @@
         </w:trPr>
         <w:tc>
           <w:tcPr>
-            <w:tcW w:w="3898" w:type="dxa"/>
+            <w:tcW w:w="3897" w:type="dxa"/>
             <w:tcBorders>
               <w:top w:val="single" w:sz="6" w:space="0" w:color="CCCCCC"/>
               <w:left w:val="single" w:sz="6" w:space="0" w:color="000000"/>
@@ -24477,7 +24484,7 @@
         </w:tc>
         <w:tc>
           <w:tcPr>
-            <w:tcW w:w="6181" w:type="dxa"/>
+            <w:tcW w:w="6182" w:type="dxa"/>
             <w:tcBorders>
               <w:top w:val="single" w:sz="6" w:space="0" w:color="CCCCCC"/>
               <w:left w:val="single" w:sz="6" w:space="0" w:color="CCCCCC"/>
@@ -24513,7 +24520,7 @@
         </w:trPr>
         <w:tc>
           <w:tcPr>
-            <w:tcW w:w="3898" w:type="dxa"/>
+            <w:tcW w:w="3897" w:type="dxa"/>
             <w:tcBorders>
               <w:top w:val="single" w:sz="6" w:space="0" w:color="CCCCCC"/>
               <w:left w:val="single" w:sz="6" w:space="0" w:color="000000"/>
@@ -24549,7 +24556,7 @@
         </w:tc>
         <w:tc>
           <w:tcPr>
-            <w:tcW w:w="6181" w:type="dxa"/>
+            <w:tcW w:w="6182" w:type="dxa"/>
             <w:tcBorders>
               <w:top w:val="single" w:sz="6" w:space="0" w:color="CCCCCC"/>
               <w:left w:val="single" w:sz="6" w:space="0" w:color="CCCCCC"/>
@@ -26592,7 +26599,7 @@
             <w:hyperlink r:id="rId53">
               <w:r>
                 <w:rPr>
-                  <w:rStyle w:val="ListLabel1569"/>
+                  <w:rStyle w:val="ListLabel406"/>
                   <w:color w:val="1155CC"/>
                   <w:sz w:val="20"/>
                   <w:szCs w:val="20"/>
@@ -27214,7 +27221,7 @@
             <w:hyperlink r:id="rId54">
               <w:r>
                 <w:rPr>
-                  <w:rStyle w:val="ListLabel1569"/>
+                  <w:rStyle w:val="ListLabel406"/>
                   <w:color w:val="1155CC"/>
                   <w:sz w:val="20"/>
                   <w:szCs w:val="20"/>
@@ -27872,7 +27879,7 @@
             <w:hyperlink r:id="rId55">
               <w:r>
                 <w:rPr>
-                  <w:rStyle w:val="ListLabel1569"/>
+                  <w:rStyle w:val="ListLabel406"/>
                   <w:color w:val="1155CC"/>
                   <w:sz w:val="20"/>
                   <w:szCs w:val="20"/>
@@ -28508,7 +28515,7 @@
             <w:hyperlink r:id="rId56">
               <w:r>
                 <w:rPr>
-                  <w:rStyle w:val="ListLabel1569"/>
+                  <w:rStyle w:val="ListLabel406"/>
                   <w:color w:val="1155CC"/>
                   <w:sz w:val="20"/>
                   <w:szCs w:val="20"/>
@@ -28535,7 +28542,7 @@
             <w:hyperlink r:id="rId57">
               <w:r>
                 <w:rPr>
-                  <w:rStyle w:val="ListLabel1569"/>
+                  <w:rStyle w:val="ListLabel406"/>
                   <w:color w:val="1155CC"/>
                   <w:sz w:val="20"/>
                   <w:szCs w:val="20"/>
@@ -28939,6 +28946,7 @@
       </w:tblGrid>
       <w:tr>
         <w:trPr>
+          <w:tblHeader w:val="true"/>
           <w:trHeight w:val="315" w:hRule="atLeast"/>
         </w:trPr>
         <w:tc>
@@ -29217,7 +29225,7 @@
             <w:hyperlink r:id="rId58">
               <w:r>
                 <w:rPr>
-                  <w:rStyle w:val="ListLabel1569"/>
+                  <w:rStyle w:val="ListLabel406"/>
                   <w:color w:val="1155CC"/>
                   <w:sz w:val="20"/>
                   <w:szCs w:val="20"/>
@@ -29851,7 +29859,7 @@
             <w:hyperlink r:id="rId59">
               <w:r>
                 <w:rPr>
-                  <w:rStyle w:val="ListLabel1569"/>
+                  <w:rStyle w:val="ListLabel406"/>
                   <w:color w:val="1155CC"/>
                   <w:sz w:val="20"/>
                   <w:szCs w:val="20"/>
@@ -30498,7 +30506,7 @@
             <w:hyperlink r:id="rId60">
               <w:r>
                 <w:rPr>
-                  <w:rStyle w:val="ListLabel1569"/>
+                  <w:rStyle w:val="ListLabel406"/>
                   <w:color w:val="1155CC"/>
                   <w:sz w:val="20"/>
                   <w:szCs w:val="20"/>
@@ -31132,7 +31140,7 @@
             <w:hyperlink r:id="rId61">
               <w:r>
                 <w:rPr>
-                  <w:rStyle w:val="ListLabel1569"/>
+                  <w:rStyle w:val="ListLabel406"/>
                   <w:color w:val="1155CC"/>
                   <w:sz w:val="20"/>
                   <w:szCs w:val="20"/>
@@ -31512,6 +31520,7 @@
       </w:tblGrid>
       <w:tr>
         <w:trPr>
+          <w:tblHeader w:val="true"/>
           <w:trHeight w:val="315" w:hRule="atLeast"/>
         </w:trPr>
         <w:tc>
@@ -31792,7 +31801,7 @@
             <w:hyperlink r:id="rId62">
               <w:r>
                 <w:rPr>
-                  <w:rStyle w:val="ListLabel1569"/>
+                  <w:rStyle w:val="ListLabel406"/>
                   <w:color w:val="1155CC"/>
                   <w:sz w:val="20"/>
                   <w:szCs w:val="20"/>
@@ -31819,7 +31828,7 @@
             <w:hyperlink r:id="rId63">
               <w:r>
                 <w:rPr>
-                  <w:rStyle w:val="ListLabel1569"/>
+                  <w:rStyle w:val="ListLabel406"/>
                   <w:color w:val="1155CC"/>
                   <w:sz w:val="20"/>
                   <w:szCs w:val="20"/>
@@ -31844,7 +31853,7 @@
             <w:hyperlink r:id="rId64">
               <w:r>
                 <w:rPr>
-                  <w:rStyle w:val="ListLabel1569"/>
+                  <w:rStyle w:val="ListLabel406"/>
                   <w:color w:val="1155CC"/>
                   <w:sz w:val="20"/>
                   <w:szCs w:val="20"/>
@@ -32377,7 +32386,7 @@
             <w:hyperlink r:id="rId65">
               <w:r>
                 <w:rPr>
-                  <w:rStyle w:val="ListLabel1569"/>
+                  <w:rStyle w:val="ListLabel406"/>
                   <w:color w:val="1155CC"/>
                   <w:sz w:val="20"/>
                   <w:szCs w:val="20"/>
@@ -32402,7 +32411,7 @@
             <w:hyperlink r:id="rId66">
               <w:r>
                 <w:rPr>
-                  <w:rStyle w:val="ListLabel1569"/>
+                  <w:rStyle w:val="ListLabel406"/>
                   <w:color w:val="1155CC"/>
                   <w:sz w:val="20"/>
                   <w:szCs w:val="20"/>
@@ -33065,7 +33074,7 @@
             <w:hyperlink r:id="rId67">
               <w:r>
                 <w:rPr>
-                  <w:rStyle w:val="ListLabel1569"/>
+                  <w:rStyle w:val="ListLabel406"/>
                   <w:color w:val="1155CC"/>
                   <w:sz w:val="20"/>
                   <w:szCs w:val="20"/>
@@ -34164,6 +34173,7 @@
       </w:tblGrid>
       <w:tr>
         <w:trPr>
+          <w:tblHeader w:val="true"/>
           <w:trHeight w:val="315" w:hRule="atLeast"/>
         </w:trPr>
         <w:tc>
@@ -34456,7 +34466,7 @@
             <w:hyperlink r:id="rId68">
               <w:r>
                 <w:rPr>
-                  <w:rStyle w:val="ListLabel1569"/>
+                  <w:rStyle w:val="ListLabel406"/>
                   <w:color w:val="1155CC"/>
                   <w:sz w:val="20"/>
                   <w:szCs w:val="20"/>
@@ -34975,7 +34985,7 @@
             <w:hyperlink r:id="rId69">
               <w:r>
                 <w:rPr>
-                  <w:rStyle w:val="ListLabel1570"/>
+                  <w:rStyle w:val="ListLabel407"/>
                   <w:color w:val="1155CC"/>
                   <w:sz w:val="18"/>
                   <w:szCs w:val="18"/>
@@ -35369,7 +35379,7 @@
     </w:pPr>
     <w:r>
       <w:drawing>
-        <wp:anchor behindDoc="1" distT="0" distB="0" distL="0" distR="0" simplePos="0" locked="0" layoutInCell="1" allowOverlap="1" relativeHeight="136">
+        <wp:anchor behindDoc="1" distT="0" distB="0" distL="0" distR="0" simplePos="0" locked="0" layoutInCell="1" allowOverlap="1" relativeHeight="135">
           <wp:simplePos x="0" y="0"/>
           <wp:positionH relativeFrom="column">
             <wp:posOffset>-669290</wp:posOffset>

</xml_diff>